<commit_message>
Separated AI SQL querying into its own service, expanded ingestion/reporting to stage and use full tenderer data (including SUMMARY-derived tender totals/variance), and updated PDF report structure/styling with revised section hierarchy, tender review columns, footer branding, and tightened Groq prompt rules for intro/recommendation content.
</commit_message>
<xml_diff>
--- a/backend/app/reporting/templates/TCR_Template.docx
+++ b/backend/app/reporting/templates/TCR_Template.docx
@@ -4,29 +4,316 @@
   <w:body>
     <w:p>
       <w:pPr>
+        <w:spacing w:after="160" w:line="278" w:lineRule="auto"/>
+        <w:ind w:left="0" w:firstLine="0"/>
+        <w:rPr>
+          <w:rFonts w:ascii="Arquitecta Black" w:eastAsiaTheme="majorEastAsia" w:hAnsi="Arquitecta Black" w:cstheme="majorBidi"/>
+          <w:color w:val="0F4761" w:themeColor="accent1" w:themeShade="BF"/>
+          <w:sz w:val="28"/>
+          <w:szCs w:val="28"/>
+          <w:lang w:val="en-US"/>
+        </w:rPr>
+      </w:pPr>
+      <w:r>
+        <w:rPr>
+          <w:noProof/>
+          <w:lang w:val="en-US"/>
+        </w:rPr>
+        <mc:AlternateContent>
+          <mc:Choice Requires="wps">
+            <w:drawing>
+              <wp:anchor distT="0" distB="0" distL="114300" distR="114300" simplePos="0" relativeHeight="251659264" behindDoc="0" locked="0" layoutInCell="1" allowOverlap="1" wp14:anchorId="76534C0A" wp14:editId="0BB36AE2">
+                <wp:simplePos x="0" y="0"/>
+                <wp:positionH relativeFrom="column">
+                  <wp:posOffset>700644</wp:posOffset>
+                </wp:positionH>
+                <wp:positionV relativeFrom="paragraph">
+                  <wp:posOffset>6412676</wp:posOffset>
+                </wp:positionV>
+                <wp:extent cx="2663687" cy="1081377"/>
+                <wp:effectExtent l="0" t="0" r="0" b="5080"/>
+                <wp:wrapNone/>
+                <wp:docPr id="1638633155" name="Text Box 4"/>
+                <wp:cNvGraphicFramePr/>
+                <a:graphic xmlns:a="http://schemas.openxmlformats.org/drawingml/2006/main">
+                  <a:graphicData uri="http://schemas.microsoft.com/office/word/2010/wordprocessingShape">
+                    <wps:wsp>
+                      <wps:cNvSpPr txBox="1"/>
+                      <wps:spPr>
+                        <a:xfrm>
+                          <a:off x="0" y="0"/>
+                          <a:ext cx="2663687" cy="1081377"/>
+                        </a:xfrm>
+                        <a:prstGeom prst="rect">
+                          <a:avLst/>
+                        </a:prstGeom>
+                        <a:noFill/>
+                        <a:ln w="6350">
+                          <a:noFill/>
+                        </a:ln>
+                      </wps:spPr>
+                      <wps:txbx>
+                        <w:txbxContent>
+                          <w:p>
+                            <w:pPr>
+                              <w:ind w:left="0"/>
+                              <w:rPr>
+                                <w:rFonts w:ascii="Tenon" w:hAnsi="Tenon"/>
+                                <w:color w:val="FFFFFF" w:themeColor="background1"/>
+                                <w:lang w:val="en-US"/>
+                              </w:rPr>
+                            </w:pPr>
+                            <w:r>
+                              <w:rPr>
+                                <w:rFonts w:ascii="Tenon" w:hAnsi="Tenon"/>
+                                <w:color w:val="FFFFFF" w:themeColor="background1"/>
+                                <w:lang w:val="en-US"/>
+                              </w:rPr>
+                              <w:t>{{</w:t>
+                            </w:r>
+                            <w:proofErr w:type="spellStart"/>
+                            <w:r>
+                              <w:rPr>
+                                <w:rFonts w:ascii="Tenon" w:hAnsi="Tenon"/>
+                                <w:color w:val="FFFFFF" w:themeColor="background1"/>
+                                <w:lang w:val="en-US"/>
+                              </w:rPr>
+                              <w:t>Project_name</w:t>
+                            </w:r>
+                            <w:proofErr w:type="spellEnd"/>
+                            <w:r>
+                              <w:rPr>
+                                <w:rFonts w:ascii="Tenon" w:hAnsi="Tenon"/>
+                                <w:color w:val="FFFFFF" w:themeColor="background1"/>
+                                <w:lang w:val="en-US"/>
+                              </w:rPr>
+                              <w:t>}}</w:t>
+                            </w:r>
+                          </w:p>
+                          <w:p>
+                            <w:pPr>
+                              <w:ind w:left="0"/>
+                              <w:rPr>
+                                <w:rFonts w:ascii="Tenon" w:hAnsi="Tenon"/>
+                                <w:color w:val="FFFFFF" w:themeColor="background1"/>
+                                <w:lang w:val="en-US"/>
+                              </w:rPr>
+                            </w:pPr>
+                            <w:r>
+                              <w:rPr>
+                                <w:rFonts w:ascii="Tenon" w:hAnsi="Tenon"/>
+                                <w:color w:val="FFFFFF" w:themeColor="background1"/>
+                                <w:lang w:val="en-US"/>
+                              </w:rPr>
+                              <w:t>Project Tender Report</w:t>
+                            </w:r>
+                            <w:r>
+                              <w:rPr>
+                                <w:rFonts w:ascii="Tenon" w:hAnsi="Tenon"/>
+                                <w:color w:val="FFFFFF" w:themeColor="background1"/>
+                                <w:lang w:val="en-US"/>
+                              </w:rPr>
+                              <w:br/>
+                            </w:r>
+                            <w:r>
+                              <w:rPr>
+                                <w:rFonts w:ascii="Tenon" w:hAnsi="Tenon"/>
+                                <w:color w:val="FFFFFF" w:themeColor="background1"/>
+                                <w:lang w:val="en-US"/>
+                              </w:rPr>
+                              <w:br/>
+                              <w:t>{{Date}}</w:t>
+                            </w:r>
+                          </w:p>
+                        </w:txbxContent>
+                      </wps:txbx>
+                      <wps:bodyPr rot="0" spcFirstLastPara="0" vertOverflow="overflow" horzOverflow="overflow" vert="horz" wrap="square" lIns="91440" tIns="45720" rIns="91440" bIns="45720" numCol="1" spcCol="0" rtlCol="0" fromWordArt="0" anchor="t" anchorCtr="0" forceAA="0" compatLnSpc="1">
+                        <a:prstTxWarp prst="textNoShape">
+                          <a:avLst/>
+                        </a:prstTxWarp>
+                        <a:noAutofit/>
+                      </wps:bodyPr>
+                    </wps:wsp>
+                  </a:graphicData>
+                </a:graphic>
+              </wp:anchor>
+            </w:drawing>
+          </mc:Choice>
+          <mc:Fallback>
+            <w:pict>
+              <v:shapetype w14:anchorId="76534C0A" id="_x0000_t202" coordsize="21600,21600" o:spt="202" path="m,l,21600r21600,l21600,xe">
+                <v:stroke joinstyle="miter"/>
+                <v:path gradientshapeok="t" o:connecttype="rect"/>
+              </v:shapetype>
+              <v:shape id="Text Box 4" o:spid="_x0000_s1026" type="#_x0000_t202" style="position:absolute;margin-left:55.15pt;margin-top:504.95pt;width:209.75pt;height:85.15pt;z-index:251659264;visibility:visible;mso-wrap-style:square;mso-wrap-distance-left:9pt;mso-wrap-distance-top:0;mso-wrap-distance-right:9pt;mso-wrap-distance-bottom:0;mso-position-horizontal:absolute;mso-position-horizontal-relative:text;mso-position-vertical:absolute;mso-position-vertical-relative:text;v-text-anchor:top" o:gfxdata="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" filled="f" stroked="f" strokeweight=".5pt">
+                <v:textbox>
+                  <w:txbxContent>
+                    <w:p>
+                      <w:pPr>
+                        <w:ind w:left="0"/>
+                        <w:rPr>
+                          <w:rFonts w:ascii="Tenon" w:hAnsi="Tenon"/>
+                          <w:color w:val="FFFFFF" w:themeColor="background1"/>
+                          <w:lang w:val="en-US"/>
+                        </w:rPr>
+                      </w:pPr>
+                      <w:r>
+                        <w:rPr>
+                          <w:rFonts w:ascii="Tenon" w:hAnsi="Tenon"/>
+                          <w:color w:val="FFFFFF" w:themeColor="background1"/>
+                          <w:lang w:val="en-US"/>
+                        </w:rPr>
+                        <w:t>{{</w:t>
+                      </w:r>
+                      <w:proofErr w:type="spellStart"/>
+                      <w:r>
+                        <w:rPr>
+                          <w:rFonts w:ascii="Tenon" w:hAnsi="Tenon"/>
+                          <w:color w:val="FFFFFF" w:themeColor="background1"/>
+                          <w:lang w:val="en-US"/>
+                        </w:rPr>
+                        <w:t>Project_name</w:t>
+                      </w:r>
+                      <w:proofErr w:type="spellEnd"/>
+                      <w:r>
+                        <w:rPr>
+                          <w:rFonts w:ascii="Tenon" w:hAnsi="Tenon"/>
+                          <w:color w:val="FFFFFF" w:themeColor="background1"/>
+                          <w:lang w:val="en-US"/>
+                        </w:rPr>
+                        <w:t>}}</w:t>
+                      </w:r>
+                    </w:p>
+                    <w:p>
+                      <w:pPr>
+                        <w:ind w:left="0"/>
+                        <w:rPr>
+                          <w:rFonts w:ascii="Tenon" w:hAnsi="Tenon"/>
+                          <w:color w:val="FFFFFF" w:themeColor="background1"/>
+                          <w:lang w:val="en-US"/>
+                        </w:rPr>
+                      </w:pPr>
+                      <w:r>
+                        <w:rPr>
+                          <w:rFonts w:ascii="Tenon" w:hAnsi="Tenon"/>
+                          <w:color w:val="FFFFFF" w:themeColor="background1"/>
+                          <w:lang w:val="en-US"/>
+                        </w:rPr>
+                        <w:t>Project Tender Report</w:t>
+                      </w:r>
+                      <w:r>
+                        <w:rPr>
+                          <w:rFonts w:ascii="Tenon" w:hAnsi="Tenon"/>
+                          <w:color w:val="FFFFFF" w:themeColor="background1"/>
+                          <w:lang w:val="en-US"/>
+                        </w:rPr>
+                        <w:br/>
+                      </w:r>
+                      <w:r>
+                        <w:rPr>
+                          <w:rFonts w:ascii="Tenon" w:hAnsi="Tenon"/>
+                          <w:color w:val="FFFFFF" w:themeColor="background1"/>
+                          <w:lang w:val="en-US"/>
+                        </w:rPr>
+                        <w:br/>
+                        <w:t>{{Date}}</w:t>
+                      </w:r>
+                    </w:p>
+                  </w:txbxContent>
+                </v:textbox>
+              </v:shape>
+            </w:pict>
+          </mc:Fallback>
+        </mc:AlternateContent>
+      </w:r>
+      <w:sdt>
+        <w:sdtPr>
+          <w:rPr>
+            <w:lang w:val="en-US"/>
+          </w:rPr>
+          <w:id w:val="-2044194771"/>
+          <w:docPartObj>
+            <w:docPartGallery w:val="Cover Pages"/>
+            <w:docPartUnique/>
+          </w:docPartObj>
+        </w:sdtPr>
+        <w:sdtContent>
+          <w:r>
+            <w:rPr>
+              <w:rFonts w:asciiTheme="minorHAnsi" w:eastAsiaTheme="minorEastAsia" w:hAnsiTheme="minorHAnsi" w:cstheme="majorBidi"/>
+              <w:noProof/>
+              <w:color w:val="0F4761" w:themeColor="accent1" w:themeShade="BF"/>
+              <w:kern w:val="0"/>
+              <w:sz w:val="22"/>
+              <w:szCs w:val="22"/>
+              <w:lang w:val="en-US"/>
+              <w14:ligatures w14:val="none"/>
+            </w:rPr>
+            <w:drawing>
+              <wp:inline distT="0" distB="0" distL="0" distR="0" wp14:anchorId="3129E5D2" wp14:editId="7441AF24">
+                <wp:extent cx="5731510" cy="8296910"/>
+                <wp:effectExtent l="0" t="0" r="2540" b="8890"/>
+                <wp:docPr id="4" name="Picture 1" descr="A blue and grey cover&#10;&#10;AI-generated content may be incorrect."/>
+                <wp:cNvGraphicFramePr>
+                  <a:graphicFrameLocks xmlns:a="http://schemas.openxmlformats.org/drawingml/2006/main" noChangeAspect="1"/>
+                </wp:cNvGraphicFramePr>
+                <a:graphic xmlns:a="http://schemas.openxmlformats.org/drawingml/2006/main">
+                  <a:graphicData uri="http://schemas.openxmlformats.org/drawingml/2006/picture">
+                    <pic:pic xmlns:pic="http://schemas.openxmlformats.org/drawingml/2006/picture">
+                      <pic:nvPicPr>
+                        <pic:cNvPr id="4" name="Picture 4" descr="A blue and grey cover&#10;&#10;AI-generated content may be incorrect."/>
+                        <pic:cNvPicPr/>
+                      </pic:nvPicPr>
+                      <pic:blipFill>
+                        <a:blip r:embed="rId7" cstate="print">
+                          <a:extLst>
+                            <a:ext uri="{28A0092B-C50C-407E-A947-70E740481C1C}">
+                              <a14:useLocalDpi xmlns:a14="http://schemas.microsoft.com/office/drawing/2010/main" val="0"/>
+                            </a:ext>
+                          </a:extLst>
+                        </a:blip>
+                        <a:stretch>
+                          <a:fillRect/>
+                        </a:stretch>
+                      </pic:blipFill>
+                      <pic:spPr>
+                        <a:xfrm>
+                          <a:off x="0" y="0"/>
+                          <a:ext cx="5731510" cy="8296910"/>
+                        </a:xfrm>
+                        <a:prstGeom prst="rect">
+                          <a:avLst/>
+                        </a:prstGeom>
+                      </pic:spPr>
+                    </pic:pic>
+                  </a:graphicData>
+                </a:graphic>
+              </wp:inline>
+            </w:drawing>
+          </w:r>
+          <w:r>
+            <w:rPr>
+              <w:lang w:val="en-US"/>
+            </w:rPr>
+            <w:br w:type="page"/>
+          </w:r>
+        </w:sdtContent>
+      </w:sdt>
+    </w:p>
+    <w:p>
+      <w:pPr>
         <w:pStyle w:val="Heading3"/>
-        <w:rPr>
-          <w:lang w:val="en-US"/>
-        </w:rPr>
       </w:pPr>
       <w:r>
-        <w:rPr>
-          <w:lang w:val="en-US"/>
-        </w:rPr>
+        <w:lastRenderedPageBreak/>
         <w:t>01 Executive Summary</w:t>
       </w:r>
     </w:p>
     <w:p>
       <w:pPr>
         <w:pStyle w:val="Heading1"/>
-        <w:rPr>
-          <w:lang w:val="en-US"/>
-        </w:rPr>
       </w:pPr>
       <w:r>
-        <w:rPr>
-          <w:lang w:val="en-US"/>
-        </w:rPr>
         <w:t>Project Information</w:t>
       </w:r>
     </w:p>
@@ -72,7 +359,6 @@
                 <w:lang w:eastAsia="en-US"/>
               </w:rPr>
             </w:pPr>
-            <w:proofErr w:type="gramStart"/>
             <w:r>
               <w:rPr>
                 <w:lang w:eastAsia="en-US"/>
@@ -84,21 +370,7 @@
               <w:rPr>
                 <w:lang w:eastAsia="en-US"/>
               </w:rPr>
-              <w:t>project</w:t>
-            </w:r>
-            <w:proofErr w:type="gramEnd"/>
-            <w:r>
-              <w:rPr>
-                <w:lang w:eastAsia="en-US"/>
-              </w:rPr>
-              <w:t>_</w:t>
-            </w:r>
-            <w:proofErr w:type="gramStart"/>
-            <w:r>
-              <w:rPr>
-                <w:lang w:eastAsia="en-US"/>
-              </w:rPr>
-              <w:t>name</w:t>
+              <w:t>project_name</w:t>
             </w:r>
             <w:proofErr w:type="spellEnd"/>
             <w:r>
@@ -107,7 +379,6 @@
               </w:rPr>
               <w:t xml:space="preserve"> }}`</w:t>
             </w:r>
-            <w:proofErr w:type="gramEnd"/>
           </w:p>
         </w:tc>
       </w:tr>
@@ -142,7 +413,6 @@
                 <w:lang w:val="en-US" w:eastAsia="en-US"/>
               </w:rPr>
             </w:pPr>
-            <w:proofErr w:type="gramStart"/>
             <w:r>
               <w:rPr>
                 <w:lang w:eastAsia="en-US"/>
@@ -154,14 +424,7 @@
               <w:rPr>
                 <w:lang w:eastAsia="en-US"/>
               </w:rPr>
-              <w:t>project</w:t>
-            </w:r>
-            <w:proofErr w:type="gramEnd"/>
-            <w:r>
-              <w:rPr>
-                <w:lang w:eastAsia="en-US"/>
-              </w:rPr>
-              <w:t>_description</w:t>
+              <w:t>project_description</w:t>
             </w:r>
             <w:proofErr w:type="spellEnd"/>
             <w:r>
@@ -204,7 +467,6 @@
                 <w:lang w:val="en-US" w:eastAsia="en-US"/>
               </w:rPr>
             </w:pPr>
-            <w:proofErr w:type="gramStart"/>
             <w:r>
               <w:rPr>
                 <w:lang w:eastAsia="en-US"/>
@@ -216,14 +478,7 @@
               <w:rPr>
                 <w:lang w:eastAsia="en-US"/>
               </w:rPr>
-              <w:t>responses</w:t>
-            </w:r>
-            <w:proofErr w:type="gramEnd"/>
-            <w:r>
-              <w:rPr>
-                <w:lang w:eastAsia="en-US"/>
-              </w:rPr>
-              <w:t>_count</w:t>
+              <w:t>responses_count</w:t>
             </w:r>
             <w:proofErr w:type="spellEnd"/>
             <w:r>
@@ -239,48 +494,8 @@
     <w:p>
       <w:pPr>
         <w:pStyle w:val="Heading1"/>
-        <w:rPr>
-          <w:lang w:val="en-US"/>
-        </w:rPr>
       </w:pPr>
       <w:r>
-        <w:rPr>
-          <w:lang w:val="en-US"/>
-        </w:rPr>
-        <w:t>{{</w:t>
-      </w:r>
-      <w:proofErr w:type="spellStart"/>
-      <w:r>
-        <w:rPr>
-          <w:lang w:val="en-US"/>
-        </w:rPr>
-        <w:t>executive</w:t>
-      </w:r>
-      <w:r>
-        <w:rPr>
-          <w:lang w:val="en-US"/>
-        </w:rPr>
-        <w:t>_summary</w:t>
-      </w:r>
-      <w:proofErr w:type="spellEnd"/>
-      <w:r>
-        <w:rPr>
-          <w:lang w:val="en-US"/>
-        </w:rPr>
-        <w:t>}}</w:t>
-      </w:r>
-    </w:p>
-    <w:p>
-      <w:pPr>
-        <w:pStyle w:val="Heading1"/>
-        <w:rPr>
-          <w:lang w:val="en-US"/>
-        </w:rPr>
-      </w:pPr>
-      <w:r>
-        <w:rPr>
-          <w:lang w:val="en-US"/>
-        </w:rPr>
         <w:t>Tender Review</w:t>
       </w:r>
     </w:p>
@@ -308,17 +523,19 @@
         <w:tc>
           <w:tcPr>
             <w:tcW w:w="2793" w:type="dxa"/>
-            <w:shd w:val="clear" w:color="auto" w:fill="E8E8E8" w:themeFill="background2"/>
+            <w:shd w:val="clear" w:color="auto" w:fill="425667"/>
           </w:tcPr>
           <w:p>
             <w:pPr>
               <w:ind w:left="0" w:firstLine="0"/>
               <w:rPr>
+                <w:color w:val="32C3E2"/>
                 <w:lang w:val="en-US" w:eastAsia="en-US"/>
               </w:rPr>
             </w:pPr>
             <w:r>
               <w:rPr>
+                <w:color w:val="32C3E2"/>
                 <w:lang w:val="en-US" w:eastAsia="en-US"/>
               </w:rPr>
               <w:t>Contractor</w:t>
@@ -328,16 +545,18 @@
         <w:tc>
           <w:tcPr>
             <w:tcW w:w="2133" w:type="dxa"/>
-            <w:shd w:val="clear" w:color="auto" w:fill="E8E8E8" w:themeFill="background2"/>
+            <w:shd w:val="clear" w:color="auto" w:fill="425667"/>
           </w:tcPr>
           <w:p>
             <w:pPr>
               <w:rPr>
+                <w:color w:val="32C3E2"/>
                 <w:lang w:val="en-US" w:eastAsia="en-US"/>
               </w:rPr>
             </w:pPr>
             <w:r>
               <w:rPr>
+                <w:color w:val="32C3E2"/>
                 <w:lang w:val="en-US" w:eastAsia="en-US"/>
               </w:rPr>
               <w:t>Final Adjusted Tender Sum</w:t>
@@ -347,17 +566,19 @@
         <w:tc>
           <w:tcPr>
             <w:tcW w:w="2282" w:type="dxa"/>
-            <w:shd w:val="clear" w:color="auto" w:fill="E8E8E8" w:themeFill="background2"/>
+            <w:shd w:val="clear" w:color="auto" w:fill="425667"/>
           </w:tcPr>
           <w:p>
             <w:pPr>
               <w:ind w:left="0" w:firstLine="0"/>
               <w:rPr>
+                <w:color w:val="32C3E2"/>
                 <w:lang w:val="en-US" w:eastAsia="en-US"/>
               </w:rPr>
             </w:pPr>
             <w:r>
               <w:rPr>
+                <w:color w:val="32C3E2"/>
                 <w:lang w:val="en-US" w:eastAsia="en-US"/>
               </w:rPr>
               <w:t>Deduct Construction Budget</w:t>
@@ -367,17 +588,19 @@
         <w:tc>
           <w:tcPr>
             <w:tcW w:w="1798" w:type="dxa"/>
-            <w:shd w:val="clear" w:color="auto" w:fill="E8E8E8" w:themeFill="background2"/>
+            <w:shd w:val="clear" w:color="auto" w:fill="425667"/>
           </w:tcPr>
           <w:p>
             <w:pPr>
               <w:ind w:left="0" w:firstLine="0"/>
               <w:rPr>
+                <w:color w:val="32C3E2"/>
                 <w:lang w:val="en-US" w:eastAsia="en-US"/>
               </w:rPr>
             </w:pPr>
             <w:r>
               <w:rPr>
+                <w:color w:val="32C3E2"/>
                 <w:lang w:val="en-US" w:eastAsia="en-US"/>
               </w:rPr>
               <w:t>Variance to Construction Budget.</w:t>
@@ -414,21 +637,7 @@
               <w:rPr>
                 <w:lang w:eastAsia="en-US"/>
               </w:rPr>
-              <w:t xml:space="preserve"> </w:t>
-            </w:r>
-            <w:proofErr w:type="gramStart"/>
-            <w:r>
-              <w:rPr>
-                <w:lang w:eastAsia="en-US"/>
-              </w:rPr>
-              <w:t>%}{{ name</w:t>
-            </w:r>
-            <w:proofErr w:type="gramEnd"/>
-            <w:r>
-              <w:rPr>
-                <w:lang w:eastAsia="en-US"/>
-              </w:rPr>
-              <w:t xml:space="preserve"> }} | {% </w:t>
+              <w:t xml:space="preserve"> %}{{ name }} | {% </w:t>
             </w:r>
             <w:proofErr w:type="spellStart"/>
             <w:r>
@@ -464,7 +673,6 @@
                 <w:lang w:val="en-US" w:eastAsia="en-US"/>
               </w:rPr>
             </w:pPr>
-            <w:proofErr w:type="gramStart"/>
             <w:r>
               <w:rPr>
                 <w:lang w:eastAsia="en-US"/>
@@ -476,35 +684,14 @@
               <w:rPr>
                 <w:lang w:eastAsia="en-US"/>
               </w:rPr>
-              <w:t>row</w:t>
-            </w:r>
-            <w:proofErr w:type="gramEnd"/>
-            <w:r>
-              <w:rPr>
-                <w:lang w:eastAsia="en-US"/>
-              </w:rPr>
-              <w:t>.final_adjusted_tender_</w:t>
-            </w:r>
-            <w:proofErr w:type="gramStart"/>
-            <w:r>
-              <w:rPr>
-                <w:lang w:eastAsia="en-US"/>
-              </w:rPr>
-              <w:t>sum</w:t>
+              <w:t>row.final_adjusted_tender_sum</w:t>
             </w:r>
             <w:proofErr w:type="spellEnd"/>
             <w:r>
               <w:rPr>
                 <w:lang w:eastAsia="en-US"/>
               </w:rPr>
-              <w:t xml:space="preserve"> }</w:t>
-            </w:r>
-            <w:proofErr w:type="gramEnd"/>
-            <w:r>
-              <w:rPr>
-                <w:lang w:eastAsia="en-US"/>
-              </w:rPr>
-              <w:t>}</w:t>
+              <w:t xml:space="preserve"> }}</w:t>
             </w:r>
           </w:p>
           <w:p>
@@ -526,7 +713,6 @@
                 <w:lang w:val="en-US" w:eastAsia="en-US"/>
               </w:rPr>
             </w:pPr>
-            <w:proofErr w:type="gramStart"/>
             <w:r>
               <w:rPr>
                 <w:lang w:val="en-US" w:eastAsia="en-US"/>
@@ -544,35 +730,14 @@
               <w:rPr>
                 <w:lang w:eastAsia="en-US"/>
               </w:rPr>
-              <w:t>row</w:t>
-            </w:r>
-            <w:proofErr w:type="gramEnd"/>
-            <w:r>
-              <w:rPr>
-                <w:lang w:eastAsia="en-US"/>
-              </w:rPr>
-              <w:t>.construction_</w:t>
-            </w:r>
-            <w:proofErr w:type="gramStart"/>
-            <w:r>
-              <w:rPr>
-                <w:lang w:eastAsia="en-US"/>
-              </w:rPr>
-              <w:t>budget</w:t>
+              <w:t>row.construction_budget</w:t>
             </w:r>
             <w:proofErr w:type="spellEnd"/>
             <w:r>
               <w:rPr>
                 <w:lang w:eastAsia="en-US"/>
               </w:rPr>
-              <w:t xml:space="preserve"> }</w:t>
-            </w:r>
-            <w:proofErr w:type="gramEnd"/>
-            <w:r>
-              <w:rPr>
-                <w:lang w:eastAsia="en-US"/>
-              </w:rPr>
-              <w:t>} </w:t>
+              <w:t xml:space="preserve"> }} </w:t>
             </w:r>
           </w:p>
         </w:tc>
@@ -591,28 +756,14 @@
               <w:rPr>
                 <w:lang w:eastAsia="en-US"/>
               </w:rPr>
-              <w:t> </w:t>
-            </w:r>
-            <w:proofErr w:type="gramStart"/>
-            <w:r>
-              <w:rPr>
-                <w:lang w:eastAsia="en-US"/>
-              </w:rPr>
-              <w:t xml:space="preserve">{{ </w:t>
+              <w:t xml:space="preserve"> {{ </w:t>
             </w:r>
             <w:proofErr w:type="spellStart"/>
             <w:r>
               <w:rPr>
                 <w:lang w:eastAsia="en-US"/>
               </w:rPr>
-              <w:t>row</w:t>
-            </w:r>
-            <w:proofErr w:type="gramEnd"/>
-            <w:r>
-              <w:rPr>
-                <w:lang w:eastAsia="en-US"/>
-              </w:rPr>
-              <w:t>.variance_to_budget</w:t>
+              <w:t>row.variance_to_budget</w:t>
             </w:r>
             <w:proofErr w:type="spellEnd"/>
             <w:r>
@@ -649,14 +800,8 @@
     <w:p>
       <w:pPr>
         <w:pStyle w:val="Heading1"/>
-        <w:rPr>
-          <w:lang w:val="en-US"/>
-        </w:rPr>
       </w:pPr>
       <w:r>
-        <w:rPr>
-          <w:lang w:val="en-US"/>
-        </w:rPr>
         <w:t>Recommendation</w:t>
       </w:r>
     </w:p>
@@ -673,39 +818,19 @@
           <w:lang w:val="en-US" w:eastAsia="en-US"/>
         </w:rPr>
       </w:pPr>
-      <w:proofErr w:type="gramStart"/>
       <w:r>
         <w:rPr>
           <w:lang w:val="en-US" w:eastAsia="en-US"/>
         </w:rPr>
-        <w:t>{{ recommendation</w:t>
-      </w:r>
-      <w:proofErr w:type="gramEnd"/>
-      <w:r>
-        <w:rPr>
-          <w:lang w:val="en-US" w:eastAsia="en-US"/>
-        </w:rPr>
-        <w:t xml:space="preserve"> }}</w:t>
+        <w:t>{{ recommendation }}</w:t>
       </w:r>
     </w:p>
     <w:p>
       <w:pPr>
         <w:pStyle w:val="Heading1"/>
-        <w:rPr>
-          <w:lang w:val="en-US"/>
-        </w:rPr>
       </w:pPr>
       <w:r>
-        <w:rPr>
-          <w:lang w:val="en-US"/>
-        </w:rPr>
-        <w:t>Recommend</w:t>
-      </w:r>
-      <w:r>
-        <w:rPr>
-          <w:lang w:val="en-US"/>
-        </w:rPr>
-        <w:t>ed Next Steps</w:t>
+        <w:t>Recommended Next Steps</w:t>
       </w:r>
     </w:p>
     <w:p>
@@ -717,6 +842,11 @@
     </w:p>
     <w:p>
       <w:pPr>
+        <w:pStyle w:val="ListParagraph"/>
+        <w:numPr>
+          <w:ilvl w:val="0"/>
+          <w:numId w:val="3"/>
+        </w:numPr>
         <w:rPr>
           <w:lang w:eastAsia="en-US"/>
         </w:rPr>
@@ -744,11 +874,11 @@
     </w:p>
     <w:p>
       <w:pPr>
+        <w:ind w:left="0" w:firstLine="0"/>
         <w:rPr>
           <w:lang w:eastAsia="en-US"/>
         </w:rPr>
       </w:pPr>
-      <w:proofErr w:type="gramStart"/>
       <w:r>
         <w:rPr>
           <w:lang w:eastAsia="en-US"/>
@@ -760,53 +890,19 @@
         <w:rPr>
           <w:lang w:eastAsia="en-US"/>
         </w:rPr>
-        <w:t>loop</w:t>
-      </w:r>
-      <w:proofErr w:type="gramEnd"/>
-      <w:r>
-        <w:rPr>
-          <w:lang w:eastAsia="en-US"/>
-        </w:rPr>
-        <w:t>.</w:t>
-      </w:r>
-      <w:proofErr w:type="gramStart"/>
-      <w:r>
-        <w:rPr>
-          <w:lang w:eastAsia="en-US"/>
-        </w:rPr>
-        <w:t>index</w:t>
+        <w:t>loop.index</w:t>
       </w:r>
       <w:proofErr w:type="spellEnd"/>
       <w:r>
         <w:rPr>
           <w:lang w:eastAsia="en-US"/>
         </w:rPr>
-        <w:t xml:space="preserve"> }</w:t>
-      </w:r>
-      <w:proofErr w:type="gramEnd"/>
-      <w:r>
-        <w:rPr>
-          <w:lang w:eastAsia="en-US"/>
-        </w:rPr>
-        <w:t xml:space="preserve">}. </w:t>
-      </w:r>
-      <w:proofErr w:type="gramStart"/>
-      <w:r>
-        <w:rPr>
-          <w:lang w:eastAsia="en-US"/>
-        </w:rPr>
-        <w:t>{{ step</w:t>
-      </w:r>
-      <w:proofErr w:type="gramEnd"/>
-      <w:r>
-        <w:rPr>
-          <w:lang w:eastAsia="en-US"/>
-        </w:rPr>
-        <w:t xml:space="preserve"> }}</w:t>
+        <w:t xml:space="preserve"> }}. {{ step }}</w:t>
       </w:r>
     </w:p>
     <w:p>
       <w:pPr>
+        <w:ind w:left="0" w:firstLine="0"/>
         <w:rPr>
           <w:lang w:eastAsia="en-US"/>
         </w:rPr>
@@ -839,12 +935,178 @@
         </w:rPr>
       </w:pPr>
     </w:p>
+    <w:p>
+      <w:pPr>
+        <w:rPr>
+          <w:i/>
+          <w:iCs/>
+          <w:lang w:eastAsia="en-US"/>
+        </w:rPr>
+      </w:pPr>
+      <w:r>
+        <w:rPr>
+          <w:i/>
+          <w:iCs/>
+          <w:lang w:eastAsia="en-US"/>
+        </w:rPr>
+        <w:t>The above figures include any adjustments we have made in the submissions to ensure an equal and fair comparison is conducted. The figures also include any deductions made by the tendering contractors following the post tender discussions and negotiations. The detailed breakdown of all tender returns is located under the appendices.</w:t>
+      </w:r>
+    </w:p>
+    <w:p>
+      <w:pPr>
+        <w:rPr>
+          <w:lang w:val="en-US" w:eastAsia="en-US"/>
+        </w:rPr>
+      </w:pPr>
+    </w:p>
+    <w:p>
+      <w:pPr>
+        <w:rPr>
+          <w:rFonts w:ascii="Archivo SemiBold" w:hAnsi="Archivo SemiBold" w:cs="Archivo SemiBold"/>
+          <w:color w:val="32C3E2"/>
+          <w:sz w:val="28"/>
+          <w:szCs w:val="28"/>
+          <w:lang w:val="en-US" w:eastAsia="en-US"/>
+        </w:rPr>
+      </w:pPr>
+      <w:r>
+        <w:rPr>
+          <w:rFonts w:ascii="Archivo SemiBold" w:hAnsi="Archivo SemiBold" w:cs="Archivo SemiBold"/>
+          <w:color w:val="32C3E2"/>
+          <w:sz w:val="28"/>
+          <w:szCs w:val="28"/>
+          <w:lang w:val="en-US" w:eastAsia="en-US"/>
+        </w:rPr>
+        <w:t>02 Introduction</w:t>
+      </w:r>
+    </w:p>
+    <w:p>
+      <w:pPr>
+        <w:pStyle w:val="Heading1"/>
+      </w:pPr>
+      <w:r>
+        <w:t>Report Overview</w:t>
+      </w:r>
+    </w:p>
+    <w:p>
+      <w:pPr>
+        <w:rPr>
+          <w:lang w:val="en-US" w:eastAsia="en-US"/>
+        </w:rPr>
+      </w:pPr>
+    </w:p>
+    <w:p>
+      <w:pPr>
+        <w:rPr>
+          <w:lang w:val="en-US" w:eastAsia="en-US"/>
+        </w:rPr>
+      </w:pPr>
+      <w:r>
+        <w:rPr>
+          <w:lang w:val="en-US" w:eastAsia="en-US"/>
+        </w:rPr>
+        <w:t>{{ introduction }}</w:t>
+      </w:r>
+    </w:p>
+    <w:p>
+      <w:pPr>
+        <w:rPr>
+          <w:rFonts w:ascii="Archivo SemiBold" w:hAnsi="Archivo SemiBold" w:cs="Archivo SemiBold"/>
+          <w:color w:val="32C3E2"/>
+          <w:sz w:val="28"/>
+          <w:szCs w:val="28"/>
+          <w:lang w:val="en-US" w:eastAsia="en-US"/>
+        </w:rPr>
+      </w:pPr>
+    </w:p>
+    <w:p>
+      <w:pPr>
+        <w:pStyle w:val="Heading1"/>
+      </w:pPr>
+      <w:r>
+        <w:t>Tenderer List</w:t>
+      </w:r>
+    </w:p>
+    <w:p>
+      <w:pPr>
+        <w:rPr>
+          <w:lang w:val="en-US" w:eastAsia="en-US"/>
+        </w:rPr>
+      </w:pPr>
+    </w:p>
+    <w:p>
+      <w:pPr>
+        <w:rPr>
+          <w:lang w:eastAsia="en-US"/>
+        </w:rPr>
+      </w:pPr>
+      <w:r>
+        <w:rPr>
+          <w:lang w:eastAsia="en-US"/>
+        </w:rPr>
+        <w:t>{% for name in tenderers %}</w:t>
+      </w:r>
+    </w:p>
+    <w:p>
+      <w:pPr>
+        <w:pStyle w:val="ListParagraph"/>
+        <w:numPr>
+          <w:ilvl w:val="0"/>
+          <w:numId w:val="3"/>
+        </w:numPr>
+        <w:rPr>
+          <w:lang w:eastAsia="en-US"/>
+        </w:rPr>
+      </w:pPr>
+      <w:r>
+        <w:rPr>
+          <w:lang w:eastAsia="en-US"/>
+        </w:rPr>
+        <w:t xml:space="preserve"> {{ name }}</w:t>
+      </w:r>
+    </w:p>
+    <w:p>
+      <w:pPr>
+        <w:rPr>
+          <w:lang w:eastAsia="en-US"/>
+        </w:rPr>
+      </w:pPr>
+      <w:r>
+        <w:rPr>
+          <w:lang w:eastAsia="en-US"/>
+        </w:rPr>
+        <w:t xml:space="preserve">{% </w:t>
+      </w:r>
+      <w:proofErr w:type="spellStart"/>
+      <w:r>
+        <w:rPr>
+          <w:lang w:eastAsia="en-US"/>
+        </w:rPr>
+        <w:t>endfor</w:t>
+      </w:r>
+      <w:proofErr w:type="spellEnd"/>
+      <w:r>
+        <w:rPr>
+          <w:lang w:eastAsia="en-US"/>
+        </w:rPr>
+        <w:t xml:space="preserve"> %}</w:t>
+      </w:r>
+    </w:p>
+    <w:p>
+      <w:pPr>
+        <w:rPr>
+          <w:lang w:val="en-US" w:eastAsia="en-US"/>
+        </w:rPr>
+      </w:pPr>
+    </w:p>
     <w:sectPr>
-      <w:headerReference w:type="default" r:id="rId7"/>
-      <w:footerReference w:type="default" r:id="rId8"/>
+      <w:headerReference w:type="default" r:id="rId8"/>
+      <w:footerReference w:type="default" r:id="rId9"/>
       <w:pgSz w:w="11906" w:h="16838"/>
       <w:pgMar w:top="1440" w:right="1440" w:bottom="1440" w:left="1440" w:header="708" w:footer="708" w:gutter="0"/>
+      <w:pgNumType w:start="0"/>
       <w:cols w:space="708"/>
+      <w:titlePg/>
       <w:docGrid w:linePitch="360"/>
     </w:sectPr>
   </w:body>
@@ -958,27 +1220,7 @@
                               <w:sz w:val="13"/>
                               <w:szCs w:val="13"/>
                             </w:rPr>
-                            <w:t>COSTPLAN SERVICES (</w:t>
-                          </w:r>
-                          <w:proofErr w:type="gramStart"/>
-                          <w:r>
-                            <w:rPr>
-                              <w:rFonts w:ascii="ArialMT" w:hAnsi="ArialMT" w:cs="ArialMT"/>
-                              <w:color w:val="415566"/>
-                              <w:sz w:val="13"/>
-                              <w:szCs w:val="13"/>
-                            </w:rPr>
-                            <w:t>SOUTH EAST</w:t>
-                          </w:r>
-                          <w:proofErr w:type="gramEnd"/>
-                          <w:r>
-                            <w:rPr>
-                              <w:rFonts w:ascii="ArialMT" w:hAnsi="ArialMT" w:cs="ArialMT"/>
-                              <w:color w:val="415566"/>
-                              <w:sz w:val="13"/>
-                              <w:szCs w:val="13"/>
-                            </w:rPr>
-                            <w:t>) LTD</w:t>
+                            <w:t>COSTPLAN SERVICES (SOUTH EAST) LTD</w:t>
                           </w:r>
                         </w:p>
                         <w:p>
@@ -1039,7 +1281,7 @@
               <v:stroke joinstyle="miter"/>
               <v:path gradientshapeok="t" o:connecttype="rect"/>
             </v:shapetype>
-            <v:shape id="Text Box 16" o:spid="_x0000_s1026" type="#_x0000_t202" style="position:absolute;left:0;text-align:left;margin-left:-16.85pt;margin-top:1.85pt;width:132.9pt;height:16.85pt;z-index:251660288;visibility:visible;mso-wrap-style:square;mso-width-percent:0;mso-height-percent:0;mso-wrap-distance-left:9pt;mso-wrap-distance-top:0;mso-wrap-distance-right:9pt;mso-wrap-distance-bottom:0;mso-position-horizontal:absolute;mso-position-horizontal-relative:text;mso-position-vertical:absolute;mso-position-vertical-relative:text;mso-width-percent:0;mso-height-percent:0;mso-width-relative:margin;mso-height-relative:margin;v-text-anchor:top" o:gfxdata="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" filled="f" stroked="f">
+            <v:shape id="Text Box 16" o:spid="_x0000_s1027" type="#_x0000_t202" style="position:absolute;left:0;text-align:left;margin-left:-16.85pt;margin-top:1.85pt;width:132.9pt;height:16.85pt;z-index:251660288;visibility:visible;mso-wrap-style:square;mso-width-percent:0;mso-height-percent:0;mso-wrap-distance-left:9pt;mso-wrap-distance-top:0;mso-wrap-distance-right:9pt;mso-wrap-distance-bottom:0;mso-position-horizontal:absolute;mso-position-horizontal-relative:text;mso-position-vertical:absolute;mso-position-vertical-relative:text;mso-width-percent:0;mso-height-percent:0;mso-width-relative:margin;mso-height-relative:margin;v-text-anchor:top" o:gfxdata="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" filled="f" stroked="f">
               <v:textbox inset="0,0,0,0">
                 <w:txbxContent>
                   <w:p>
@@ -1062,27 +1304,7 @@
                         <w:sz w:val="13"/>
                         <w:szCs w:val="13"/>
                       </w:rPr>
-                      <w:t>COSTPLAN SERVICES (</w:t>
-                    </w:r>
-                    <w:proofErr w:type="gramStart"/>
-                    <w:r>
-                      <w:rPr>
-                        <w:rFonts w:ascii="ArialMT" w:hAnsi="ArialMT" w:cs="ArialMT"/>
-                        <w:color w:val="415566"/>
-                        <w:sz w:val="13"/>
-                        <w:szCs w:val="13"/>
-                      </w:rPr>
-                      <w:t>SOUTH EAST</w:t>
-                    </w:r>
-                    <w:proofErr w:type="gramEnd"/>
-                    <w:r>
-                      <w:rPr>
-                        <w:rFonts w:ascii="ArialMT" w:hAnsi="ArialMT" w:cs="ArialMT"/>
-                        <w:color w:val="415566"/>
-                        <w:sz w:val="13"/>
-                        <w:szCs w:val="13"/>
-                      </w:rPr>
-                      <w:t>) LTD</w:t>
+                      <w:t>COSTPLAN SERVICES (SOUTH EAST) LTD</w:t>
                     </w:r>
                   </w:p>
                   <w:p>
@@ -1248,7 +1470,7 @@
         </mc:Choice>
         <mc:Fallback>
           <w:pict>
-            <v:shape w14:anchorId="1FD7336B" id="Text Box 21" o:spid="_x0000_s1027" type="#_x0000_t202" style="position:absolute;left:0;text-align:left;margin-left:115.45pt;margin-top:-55.55pt;width:79.65pt;height:76.25pt;z-index:-251655168;visibility:visible;mso-wrap-style:square;mso-width-percent:0;mso-height-percent:0;mso-wrap-distance-left:9pt;mso-wrap-distance-top:0;mso-wrap-distance-right:9pt;mso-wrap-distance-bottom:0;mso-position-horizontal:absolute;mso-position-horizontal-relative:text;mso-position-vertical:absolute;mso-position-vertical-relative:text;mso-width-percent:0;mso-height-percent:0;mso-width-relative:margin;mso-height-relative:margin;v-text-anchor:top" o:gfxdata="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" filled="f" stroked="f">
+            <v:shape w14:anchorId="1FD7336B" id="Text Box 21" o:spid="_x0000_s1028" type="#_x0000_t202" style="position:absolute;left:0;text-align:left;margin-left:115.45pt;margin-top:-55.55pt;width:79.65pt;height:76.25pt;z-index:-251655168;visibility:visible;mso-wrap-style:square;mso-width-percent:0;mso-height-percent:0;mso-wrap-distance-left:9pt;mso-wrap-distance-top:0;mso-wrap-distance-right:9pt;mso-wrap-distance-bottom:0;mso-position-horizontal:absolute;mso-position-horizontal-relative:text;mso-position-vertical:absolute;mso-position-vertical-relative:text;mso-width-percent:0;mso-height-percent:0;mso-width-relative:margin;mso-height-relative:margin;v-text-anchor:top" o:gfxdata="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" filled="f" stroked="f">
               <v:textbox>
                 <w:txbxContent>
                   <w:p>
@@ -1383,7 +1605,7 @@
         </mc:Choice>
         <mc:Fallback>
           <w:pict>
-            <v:shape w14:anchorId="2A7D0C0D" id="Text Box 12" o:spid="_x0000_s1028" type="#_x0000_t202" style="position:absolute;left:0;text-align:left;margin-left:-15.45pt;margin-top:-5.75pt;width:511.35pt;height:50.15pt;z-index:-251657216;visibility:visible;mso-wrap-style:square;mso-width-percent:0;mso-height-percent:0;mso-wrap-distance-left:9pt;mso-wrap-distance-top:0;mso-wrap-distance-right:9pt;mso-wrap-distance-bottom:0;mso-position-horizontal:absolute;mso-position-horizontal-relative:text;mso-position-vertical:absolute;mso-position-vertical-relative:text;mso-width-percent:0;mso-height-percent:0;mso-width-relative:margin;mso-height-relative:margin;v-text-anchor:top" o:gfxdata="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" filled="f" stroked="f">
+            <v:shape w14:anchorId="2A7D0C0D" id="Text Box 12" o:spid="_x0000_s1029" type="#_x0000_t202" style="position:absolute;left:0;text-align:left;margin-left:-15.45pt;margin-top:-5.75pt;width:511.35pt;height:50.15pt;z-index:-251657216;visibility:visible;mso-wrap-style:square;mso-width-percent:0;mso-height-percent:0;mso-wrap-distance-left:9pt;mso-wrap-distance-top:0;mso-wrap-distance-right:9pt;mso-wrap-distance-bottom:0;mso-position-horizontal:absolute;mso-position-horizontal-relative:text;mso-position-vertical:absolute;mso-position-vertical-relative:text;mso-width-percent:0;mso-height-percent:0;mso-width-relative:margin;mso-height-relative:margin;v-text-anchor:top" o:gfxdata="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" filled="f" stroked="f">
               <v:textbox inset="0,0,0,0">
                 <w:txbxContent>
                   <w:p/>
@@ -1521,6 +1743,205 @@
 <file path=word/numbering.xml><?xml version="1.0" encoding="utf-8"?>
 <w:numbering xmlns:wpc="http://schemas.microsoft.com/office/word/2010/wordprocessingCanvas" xmlns:cx="http://schemas.microsoft.com/office/drawing/2014/chartex" xmlns:cx1="http://schemas.microsoft.com/office/drawing/2015/9/8/chartex" xmlns:cx2="http://schemas.microsoft.com/office/drawing/2015/10/21/chartex" xmlns:cx3="http://schemas.microsoft.com/office/drawing/2016/5/9/chartex" xmlns:cx4="http://schemas.microsoft.com/office/drawing/2016/5/10/chartex" xmlns:cx5="http://schemas.microsoft.com/office/drawing/2016/5/11/chartex" xmlns:cx6="http://schemas.microsoft.com/office/drawing/2016/5/12/chartex" xmlns:cx7="http://schemas.microsoft.com/office/drawing/2016/5/13/chartex" xmlns:cx8="http://schemas.microsoft.com/office/drawing/2016/5/14/chartex" xmlns:mc="http://schemas.openxmlformats.org/markup-compatibility/2006" xmlns:aink="http://schemas.microsoft.com/office/drawing/2016/ink" xmlns:am3d="http://schemas.microsoft.com/office/drawing/2017/model3d" xmlns:o="urn:schemas-microsoft-com:office:office" xmlns:oel="http://schemas.microsoft.com/office/2019/extlst" xmlns:r="http://schemas.openxmlformats.org/officeDocument/2006/relationships" xmlns:m="http://schemas.openxmlformats.org/officeDocument/2006/math" xmlns:v="urn:schemas-microsoft-com:vml" xmlns:wp14="http://schemas.microsoft.com/office/word/2010/wordprocessingDrawing" xmlns:wp="http://schemas.openxmlformats.org/drawingml/2006/wordprocessingDrawing" xmlns:w10="urn:schemas-microsoft-com:office:word" xmlns:w="http://schemas.openxmlformats.org/wordprocessingml/2006/main" xmlns:w14="http://schemas.microsoft.com/office/word/2010/wordml" xmlns:w15="http://schemas.microsoft.com/office/word/2012/wordml" xmlns:w16cex="http://schemas.microsoft.com/office/word/2018/wordml/cex" xmlns:w16cid="http://schemas.microsoft.com/office/word/2016/wordml/cid" xmlns:w16="http://schemas.microsoft.com/office/word/2018/wordml" xmlns:w16du="http://schemas.microsoft.com/office/word/2023/wordml/word16du" xmlns:w16sdtdh="http://schemas.microsoft.com/office/word/2020/wordml/sdtdatahash" xmlns:w16sdtfl="http://schemas.microsoft.com/office/word/2024/wordml/sdtformatlock" xmlns:w16se="http://schemas.microsoft.com/office/word/2015/wordml/symex" xmlns:wpg="http://schemas.microsoft.com/office/word/2010/wordprocessingGroup" xmlns:wpi="http://schemas.microsoft.com/office/word/2010/wordprocessingInk" xmlns:wne="http://schemas.microsoft.com/office/word/2006/wordml" xmlns:wps="http://schemas.microsoft.com/office/word/2010/wordprocessingShape" mc:Ignorable="w14 w15 w16se w16cid w16 w16cex w16sdtdh w16sdtfl w16du wp14">
   <w:abstractNum w:abstractNumId="0" w15:restartNumberingAfterBreak="0">
+    <w:nsid w:val="11FA52D9"/>
+    <w:multiLevelType w:val="hybridMultilevel"/>
+    <w:tmpl w:val="D0FCDA7E"/>
+    <w:lvl w:ilvl="0" w:tplc="F7AAC526">
+      <w:start w:val="2"/>
+      <w:numFmt w:val="bullet"/>
+      <w:lvlText w:val="-"/>
+      <w:lvlJc w:val="left"/>
+      <w:pPr>
+        <w:ind w:left="720" w:hanging="360"/>
+      </w:pPr>
+      <w:rPr>
+        <w:rFonts w:ascii="Archivo Light" w:eastAsia="Arial" w:hAnsi="Archivo Light" w:cs="Archivo Light" w:hint="default"/>
+      </w:rPr>
+    </w:lvl>
+    <w:lvl w:ilvl="1" w:tplc="08090003" w:tentative="1">
+      <w:start w:val="1"/>
+      <w:numFmt w:val="bullet"/>
+      <w:lvlText w:val="o"/>
+      <w:lvlJc w:val="left"/>
+      <w:pPr>
+        <w:ind w:left="1440" w:hanging="360"/>
+      </w:pPr>
+      <w:rPr>
+        <w:rFonts w:ascii="Courier New" w:hAnsi="Courier New" w:cs="Courier New" w:hint="default"/>
+      </w:rPr>
+    </w:lvl>
+    <w:lvl w:ilvl="2" w:tplc="08090005" w:tentative="1">
+      <w:start w:val="1"/>
+      <w:numFmt w:val="bullet"/>
+      <w:lvlText w:val=""/>
+      <w:lvlJc w:val="left"/>
+      <w:pPr>
+        <w:ind w:left="2160" w:hanging="360"/>
+      </w:pPr>
+      <w:rPr>
+        <w:rFonts w:ascii="Wingdings" w:hAnsi="Wingdings" w:hint="default"/>
+      </w:rPr>
+    </w:lvl>
+    <w:lvl w:ilvl="3" w:tplc="08090001" w:tentative="1">
+      <w:start w:val="1"/>
+      <w:numFmt w:val="bullet"/>
+      <w:lvlText w:val=""/>
+      <w:lvlJc w:val="left"/>
+      <w:pPr>
+        <w:ind w:left="2880" w:hanging="360"/>
+      </w:pPr>
+      <w:rPr>
+        <w:rFonts w:ascii="Symbol" w:hAnsi="Symbol" w:hint="default"/>
+      </w:rPr>
+    </w:lvl>
+    <w:lvl w:ilvl="4" w:tplc="08090003" w:tentative="1">
+      <w:start w:val="1"/>
+      <w:numFmt w:val="bullet"/>
+      <w:lvlText w:val="o"/>
+      <w:lvlJc w:val="left"/>
+      <w:pPr>
+        <w:ind w:left="3600" w:hanging="360"/>
+      </w:pPr>
+      <w:rPr>
+        <w:rFonts w:ascii="Courier New" w:hAnsi="Courier New" w:cs="Courier New" w:hint="default"/>
+      </w:rPr>
+    </w:lvl>
+    <w:lvl w:ilvl="5" w:tplc="08090005" w:tentative="1">
+      <w:start w:val="1"/>
+      <w:numFmt w:val="bullet"/>
+      <w:lvlText w:val=""/>
+      <w:lvlJc w:val="left"/>
+      <w:pPr>
+        <w:ind w:left="4320" w:hanging="360"/>
+      </w:pPr>
+      <w:rPr>
+        <w:rFonts w:ascii="Wingdings" w:hAnsi="Wingdings" w:hint="default"/>
+      </w:rPr>
+    </w:lvl>
+    <w:lvl w:ilvl="6" w:tplc="08090001" w:tentative="1">
+      <w:start w:val="1"/>
+      <w:numFmt w:val="bullet"/>
+      <w:lvlText w:val=""/>
+      <w:lvlJc w:val="left"/>
+      <w:pPr>
+        <w:ind w:left="5040" w:hanging="360"/>
+      </w:pPr>
+      <w:rPr>
+        <w:rFonts w:ascii="Symbol" w:hAnsi="Symbol" w:hint="default"/>
+      </w:rPr>
+    </w:lvl>
+    <w:lvl w:ilvl="7" w:tplc="08090003" w:tentative="1">
+      <w:start w:val="1"/>
+      <w:numFmt w:val="bullet"/>
+      <w:lvlText w:val="o"/>
+      <w:lvlJc w:val="left"/>
+      <w:pPr>
+        <w:ind w:left="5760" w:hanging="360"/>
+      </w:pPr>
+      <w:rPr>
+        <w:rFonts w:ascii="Courier New" w:hAnsi="Courier New" w:cs="Courier New" w:hint="default"/>
+      </w:rPr>
+    </w:lvl>
+    <w:lvl w:ilvl="8" w:tplc="08090005" w:tentative="1">
+      <w:start w:val="1"/>
+      <w:numFmt w:val="bullet"/>
+      <w:lvlText w:val=""/>
+      <w:lvlJc w:val="left"/>
+      <w:pPr>
+        <w:ind w:left="6480" w:hanging="360"/>
+      </w:pPr>
+      <w:rPr>
+        <w:rFonts w:ascii="Wingdings" w:hAnsi="Wingdings" w:hint="default"/>
+      </w:rPr>
+    </w:lvl>
+  </w:abstractNum>
+  <w:abstractNum w:abstractNumId="1" w15:restartNumberingAfterBreak="0">
+    <w:nsid w:val="157562D4"/>
+    <w:multiLevelType w:val="hybridMultilevel"/>
+    <w:tmpl w:val="556809C6"/>
+    <w:lvl w:ilvl="0" w:tplc="0809000F">
+      <w:start w:val="1"/>
+      <w:numFmt w:val="decimal"/>
+      <w:lvlText w:val="%1."/>
+      <w:lvlJc w:val="left"/>
+      <w:pPr>
+        <w:ind w:left="720" w:hanging="360"/>
+      </w:pPr>
+    </w:lvl>
+    <w:lvl w:ilvl="1" w:tplc="08090019" w:tentative="1">
+      <w:start w:val="1"/>
+      <w:numFmt w:val="lowerLetter"/>
+      <w:lvlText w:val="%2."/>
+      <w:lvlJc w:val="left"/>
+      <w:pPr>
+        <w:ind w:left="1440" w:hanging="360"/>
+      </w:pPr>
+    </w:lvl>
+    <w:lvl w:ilvl="2" w:tplc="0809001B" w:tentative="1">
+      <w:start w:val="1"/>
+      <w:numFmt w:val="lowerRoman"/>
+      <w:lvlText w:val="%3."/>
+      <w:lvlJc w:val="right"/>
+      <w:pPr>
+        <w:ind w:left="2160" w:hanging="180"/>
+      </w:pPr>
+    </w:lvl>
+    <w:lvl w:ilvl="3" w:tplc="0809000F" w:tentative="1">
+      <w:start w:val="1"/>
+      <w:numFmt w:val="decimal"/>
+      <w:lvlText w:val="%4."/>
+      <w:lvlJc w:val="left"/>
+      <w:pPr>
+        <w:ind w:left="2880" w:hanging="360"/>
+      </w:pPr>
+    </w:lvl>
+    <w:lvl w:ilvl="4" w:tplc="08090019" w:tentative="1">
+      <w:start w:val="1"/>
+      <w:numFmt w:val="lowerLetter"/>
+      <w:lvlText w:val="%5."/>
+      <w:lvlJc w:val="left"/>
+      <w:pPr>
+        <w:ind w:left="3600" w:hanging="360"/>
+      </w:pPr>
+    </w:lvl>
+    <w:lvl w:ilvl="5" w:tplc="0809001B" w:tentative="1">
+      <w:start w:val="1"/>
+      <w:numFmt w:val="lowerRoman"/>
+      <w:lvlText w:val="%6."/>
+      <w:lvlJc w:val="right"/>
+      <w:pPr>
+        <w:ind w:left="4320" w:hanging="180"/>
+      </w:pPr>
+    </w:lvl>
+    <w:lvl w:ilvl="6" w:tplc="0809000F" w:tentative="1">
+      <w:start w:val="1"/>
+      <w:numFmt w:val="decimal"/>
+      <w:lvlText w:val="%7."/>
+      <w:lvlJc w:val="left"/>
+      <w:pPr>
+        <w:ind w:left="5040" w:hanging="360"/>
+      </w:pPr>
+    </w:lvl>
+    <w:lvl w:ilvl="7" w:tplc="08090019" w:tentative="1">
+      <w:start w:val="1"/>
+      <w:numFmt w:val="lowerLetter"/>
+      <w:lvlText w:val="%8."/>
+      <w:lvlJc w:val="left"/>
+      <w:pPr>
+        <w:ind w:left="5760" w:hanging="360"/>
+      </w:pPr>
+    </w:lvl>
+    <w:lvl w:ilvl="8" w:tplc="0809001B" w:tentative="1">
+      <w:start w:val="1"/>
+      <w:numFmt w:val="lowerRoman"/>
+      <w:lvlText w:val="%9."/>
+      <w:lvlJc w:val="right"/>
+      <w:pPr>
+        <w:ind w:left="6480" w:hanging="180"/>
+      </w:pPr>
+    </w:lvl>
+  </w:abstractNum>
+  <w:abstractNum w:abstractNumId="2" w15:restartNumberingAfterBreak="0">
     <w:nsid w:val="1A0B5148"/>
     <w:multiLevelType w:val="multilevel"/>
     <w:tmpl w:val="311C5276"/>
@@ -1657,6 +2078,12 @@
     </w:lvl>
   </w:abstractNum>
   <w:num w:numId="1" w16cid:durableId="966743814">
+    <w:abstractNumId w:val="2"/>
+  </w:num>
+  <w:num w:numId="2" w16cid:durableId="801651272">
+    <w:abstractNumId w:val="1"/>
+  </w:num>
+  <w:num w:numId="3" w16cid:durableId="1640914773">
     <w:abstractNumId w:val="0"/>
   </w:num>
 </w:numbering>
@@ -2082,7 +2509,7 @@
     <w:autoRedefine/>
     <w:uiPriority w:val="9"/>
     <w:qFormat/>
-    <w:rsid w:val="009425AC"/>
+    <w:rsid w:val="00CD0000"/>
     <w:pPr>
       <w:keepNext/>
       <w:keepLines/>
@@ -2091,9 +2518,9 @@
     </w:pPr>
     <w:rPr>
       <w:rFonts w:eastAsiaTheme="majorEastAsia" w:cstheme="majorBidi"/>
-      <w:color w:val="1F497D"/>
-      <w:szCs w:val="32"/>
-      <w:lang w:eastAsia="en-US"/>
+      <w:color w:val="425667"/>
+      <w:sz w:val="24"/>
+      <w:lang w:val="en-US" w:eastAsia="en-US"/>
     </w:rPr>
   </w:style>
   <w:style w:type="paragraph" w:styleId="Heading2">
@@ -2127,7 +2554,7 @@
     <w:uiPriority w:val="9"/>
     <w:unhideWhenUsed/>
     <w:qFormat/>
-    <w:rsid w:val="00982B74"/>
+    <w:rsid w:val="00CD0000"/>
     <w:pPr>
       <w:keepNext/>
       <w:keepLines/>
@@ -2135,10 +2562,11 @@
       <w:outlineLvl w:val="2"/>
     </w:pPr>
     <w:rPr>
-      <w:rFonts w:ascii="Arquitecta Black" w:eastAsiaTheme="majorEastAsia" w:hAnsi="Arquitecta Black" w:cstheme="majorBidi"/>
-      <w:color w:val="0F4761" w:themeColor="accent1" w:themeShade="BF"/>
+      <w:rFonts w:ascii="Archivo SemiBold" w:eastAsiaTheme="majorEastAsia" w:hAnsi="Archivo SemiBold" w:cs="Archivo SemiBold"/>
+      <w:color w:val="00B0F0"/>
       <w:sz w:val="28"/>
       <w:szCs w:val="28"/>
+      <w:lang w:val="en-US"/>
     </w:rPr>
   </w:style>
   <w:style w:type="paragraph" w:styleId="Heading4">
@@ -2316,12 +2744,13 @@
     <w:basedOn w:val="DefaultParagraphFont"/>
     <w:link w:val="Heading3"/>
     <w:uiPriority w:val="9"/>
-    <w:rsid w:val="00982B74"/>
+    <w:rsid w:val="00CD0000"/>
     <w:rPr>
-      <w:rFonts w:ascii="Arquitecta Black" w:eastAsiaTheme="majorEastAsia" w:hAnsi="Arquitecta Black" w:cstheme="majorBidi"/>
-      <w:color w:val="0F4761" w:themeColor="accent1" w:themeShade="BF"/>
+      <w:rFonts w:ascii="Archivo SemiBold" w:eastAsiaTheme="majorEastAsia" w:hAnsi="Archivo SemiBold" w:cs="Archivo SemiBold"/>
+      <w:color w:val="00B0F0"/>
       <w:sz w:val="28"/>
       <w:szCs w:val="28"/>
+      <w:lang w:val="en-US" w:eastAsia="en-GB"/>
     </w:rPr>
   </w:style>
   <w:style w:type="character" w:customStyle="1" w:styleId="Heading1Char">
@@ -2329,12 +2758,11 @@
     <w:basedOn w:val="DefaultParagraphFont"/>
     <w:link w:val="Heading1"/>
     <w:uiPriority w:val="9"/>
-    <w:rsid w:val="009425AC"/>
+    <w:rsid w:val="00CD0000"/>
     <w:rPr>
-      <w:rFonts w:ascii="Calibri" w:eastAsiaTheme="majorEastAsia" w:hAnsi="Calibri" w:cstheme="majorBidi"/>
-      <w:color w:val="1F497D"/>
-      <w:sz w:val="22"/>
-      <w:szCs w:val="32"/>
+      <w:rFonts w:ascii="Archivo Light" w:eastAsiaTheme="majorEastAsia" w:hAnsi="Archivo Light" w:cstheme="majorBidi"/>
+      <w:color w:val="425667"/>
+      <w:lang w:val="en-US"/>
     </w:rPr>
   </w:style>
   <w:style w:type="paragraph" w:styleId="Title">

</xml_diff>

<commit_message>
created sheet aliases to match the new excel template
</commit_message>
<xml_diff>
--- a/backend/app/reporting/templates/TCR_Template.docx
+++ b/backend/app/reporting/templates/TCR_Template.docx
@@ -1680,61 +1680,6 @@
       <w:rPr>
         <w:noProof/>
       </w:rPr>
-      <w:drawing>
-        <wp:anchor distT="0" distB="0" distL="0" distR="0" simplePos="0" relativeHeight="251663360" behindDoc="1" locked="0" layoutInCell="1" allowOverlap="1" wp14:anchorId="4D30BBAA" wp14:editId="2EE0A14B">
-          <wp:simplePos x="0" y="0"/>
-          <wp:positionH relativeFrom="page">
-            <wp:posOffset>6303420</wp:posOffset>
-          </wp:positionH>
-          <wp:positionV relativeFrom="page">
-            <wp:posOffset>188514</wp:posOffset>
-          </wp:positionV>
-          <wp:extent cx="973455" cy="797560"/>
-          <wp:effectExtent l="0" t="0" r="0" b="0"/>
-          <wp:wrapNone/>
-          <wp:docPr id="3" name="image2.jpeg"/>
-          <wp:cNvGraphicFramePr>
-            <a:graphicFrameLocks xmlns:a="http://schemas.openxmlformats.org/drawingml/2006/main" noChangeAspect="1"/>
-          </wp:cNvGraphicFramePr>
-          <a:graphic xmlns:a="http://schemas.openxmlformats.org/drawingml/2006/main">
-            <a:graphicData uri="http://schemas.openxmlformats.org/drawingml/2006/picture">
-              <pic:pic xmlns:pic="http://schemas.openxmlformats.org/drawingml/2006/picture">
-                <pic:nvPicPr>
-                  <pic:cNvPr id="3" name="image2.jpeg"/>
-                  <pic:cNvPicPr/>
-                </pic:nvPicPr>
-                <pic:blipFill>
-                  <a:blip r:embed="rId1">
-                    <a:extLst>
-                      <a:ext uri="{28A0092B-C50C-407E-A947-70E740481C1C}">
-                        <a14:useLocalDpi xmlns:a14="http://schemas.microsoft.com/office/drawing/2010/main" val="0"/>
-                      </a:ext>
-                    </a:extLst>
-                  </a:blip>
-                  <a:stretch>
-                    <a:fillRect/>
-                  </a:stretch>
-                </pic:blipFill>
-                <pic:spPr>
-                  <a:xfrm>
-                    <a:off x="0" y="0"/>
-                    <a:ext cx="973455" cy="797560"/>
-                  </a:xfrm>
-                  <a:prstGeom prst="rect">
-                    <a:avLst/>
-                  </a:prstGeom>
-                </pic:spPr>
-              </pic:pic>
-            </a:graphicData>
-          </a:graphic>
-          <wp14:sizeRelH relativeFrom="margin">
-            <wp14:pctWidth>0</wp14:pctWidth>
-          </wp14:sizeRelH>
-          <wp14:sizeRelV relativeFrom="margin">
-            <wp14:pctHeight>0</wp14:pctHeight>
-          </wp14:sizeRelV>
-        </wp:anchor>
-      </w:drawing>
     </w:r>
   </w:p>
 </w:hdr>

</xml_diff>